<commit_message>
fix image, pdf et téléchargements
</commit_message>
<xml_diff>
--- a/docs-alaotra/rapport-alaotra.docx
+++ b/docs-alaotra/rapport-alaotra.docx
@@ -87,7 +87,7 @@
                     </pic:cNvPicPr>
                   </pic:nvPicPr>
                   <pic:blipFill>
-                    <a:blip r:embed="rId1033"/>
+                    <a:blip r:embed="rId1031"/>
                     <a:stretch>
                       <a:fillRect/>
                     </a:stretch>
@@ -20837,7 +20837,7 @@
     </w:tbl>
     <w:bookmarkEnd w:id="987"/>
     <w:bookmarkEnd w:id="988"/>
-    <w:bookmarkStart w:id="1017" w:name="références"/>
+    <w:bookmarkStart w:id="1015" w:name="références"/>
     <w:p>
       <w:pPr>
         <w:pStyle w:val="Titre1"/>
@@ -21434,238 +21434,218 @@
     <w:bookmarkEnd w:id="1011"/>
     <w:bookmarkEnd w:id="1012"/>
     <w:bookmarkEnd w:id="1013"/>
-    <w:bookmarkStart w:id="1014" w:name="liste-des-figures"/>
+    <w:bookmarkStart w:id="1014" w:name="liste-des-acronymes"/>
     <w:p>
       <w:pPr>
         <w:pStyle w:val="Titre2"/>
       </w:pPr>
       <w:r>
-        <w:t xml:space="preserve">Liste des figures</w:t>
+        <w:t xml:space="preserve">Liste des acronymes</w:t>
+      </w:r>
+    </w:p>
+    <w:p>
+      <w:pPr>
+        <w:pStyle w:val="FirstParagraph"/>
+      </w:pPr>
+      <w:r>
+        <w:t xml:space="preserve">AP : Aire Protégée</w:t>
+      </w:r>
+    </w:p>
+    <w:p>
+      <w:pPr>
+        <w:pStyle w:val="Corpsdetexte"/>
+      </w:pPr>
+      <w:r>
+        <w:t xml:space="preserve">BETSAKA : Biodiversity-Economic Tradeoff and Synergy Assessments for Conservation Areas</w:t>
+      </w:r>
+    </w:p>
+    <w:p>
+      <w:pPr>
+        <w:pStyle w:val="Corpsdetexte"/>
+      </w:pPr>
+      <w:r>
+        <w:t xml:space="preserve">BTP : Bâtiment et Travaux Publics</w:t>
+      </w:r>
+    </w:p>
+    <w:p>
+      <w:pPr>
+        <w:pStyle w:val="Corpsdetexte"/>
+      </w:pPr>
+      <w:r>
+        <w:t xml:space="preserve">CE : Cours Élémentaire</w:t>
+      </w:r>
+    </w:p>
+    <w:p>
+      <w:pPr>
+        <w:pStyle w:val="Corpsdetexte"/>
+      </w:pPr>
+      <w:r>
+        <w:t xml:space="preserve">CERED : Centre d’Études et de Recherches Économiques pour le Développement</w:t>
+      </w:r>
+    </w:p>
+    <w:p>
+      <w:pPr>
+        <w:pStyle w:val="Corpsdetexte"/>
+      </w:pPr>
+      <w:r>
+        <w:t xml:space="preserve">CITI rév.4 : Classification internationale type, par industrie, de toutes les branches d’activité économique, révision 4</w:t>
+      </w:r>
+    </w:p>
+    <w:p>
+      <w:pPr>
+        <w:pStyle w:val="Corpsdetexte"/>
+      </w:pPr>
+      <w:r>
+        <w:t xml:space="preserve">CM : Chef de ménage</w:t>
+      </w:r>
+    </w:p>
+    <w:p>
+      <w:pPr>
+        <w:pStyle w:val="Corpsdetexte"/>
+      </w:pPr>
+      <w:r>
+        <w:t xml:space="preserve">CM1 : Cours Moyen 1ère année</w:t>
+      </w:r>
+    </w:p>
+    <w:p>
+      <w:pPr>
+        <w:pStyle w:val="Corpsdetexte"/>
+      </w:pPr>
+      <w:r>
+        <w:t xml:space="preserve">CM2 : Cours Moyen 2ème année</w:t>
+      </w:r>
+    </w:p>
+    <w:p>
+      <w:pPr>
+        <w:pStyle w:val="Corpsdetexte"/>
+      </w:pPr>
+      <w:r>
+        <w:t xml:space="preserve">CP1 : Cours Préparatoire 1ère année</w:t>
+      </w:r>
+    </w:p>
+    <w:p>
+      <w:pPr>
+        <w:pStyle w:val="Corpsdetexte"/>
+      </w:pPr>
+      <w:r>
+        <w:t xml:space="preserve">CP2 : Cours Préparatoire 2ème année</w:t>
+      </w:r>
+    </w:p>
+    <w:p>
+      <w:pPr>
+        <w:pStyle w:val="Corpsdetexte"/>
+      </w:pPr>
+      <w:r>
+        <w:t xml:space="preserve">DGM : Direction Générale de la Météorologie</w:t>
+      </w:r>
+    </w:p>
+    <w:p>
+      <w:pPr>
+        <w:pStyle w:val="Corpsdetexte"/>
+      </w:pPr>
+      <w:r>
+        <w:t xml:space="preserve">GPS : Global Positioning System</w:t>
+      </w:r>
+    </w:p>
+    <w:p>
+      <w:pPr>
+        <w:pStyle w:val="Corpsdetexte"/>
+      </w:pPr>
+      <w:r>
+        <w:t xml:space="preserve">HIMO : Haute Intensité de Main-d’Œuvre</w:t>
+      </w:r>
+    </w:p>
+    <w:p>
+      <w:pPr>
+        <w:pStyle w:val="Corpsdetexte"/>
+      </w:pPr>
+      <w:r>
+        <w:t xml:space="preserve">INSTAT : Institut National de la Statistique</w:t>
+      </w:r>
+    </w:p>
+    <w:p>
+      <w:pPr>
+        <w:pStyle w:val="Corpsdetexte"/>
+      </w:pPr>
+      <w:r>
+        <w:t xml:space="preserve">IPC : Indice des Prix à la Consommation</w:t>
+      </w:r>
+    </w:p>
+    <w:p>
+      <w:pPr>
+        <w:pStyle w:val="Corpsdetexte"/>
+      </w:pPr>
+      <w:r>
+        <w:t xml:space="preserve">IRD : Institut de Recherche pour le Développement</w:t>
+      </w:r>
+    </w:p>
+    <w:p>
+      <w:pPr>
+        <w:pStyle w:val="Corpsdetexte"/>
+      </w:pPr>
+      <w:r>
+        <w:t xml:space="preserve">Nb : Nombre</w:t>
+      </w:r>
+    </w:p>
+    <w:p>
+      <w:pPr>
+        <w:pStyle w:val="Corpsdetexte"/>
+      </w:pPr>
+      <w:r>
+        <w:t xml:space="preserve">OCDE : Organisation de Coopération et de Développement Économiques</w:t>
+      </w:r>
+    </w:p>
+    <w:p>
+      <w:pPr>
+        <w:pStyle w:val="Corpsdetexte"/>
+      </w:pPr>
+      <w:r>
+        <w:t xml:space="preserve">OR : Observatoire rural</w:t>
+      </w:r>
+    </w:p>
+    <w:p>
+      <w:pPr>
+        <w:pStyle w:val="Corpsdetexte"/>
+      </w:pPr>
+      <w:r>
+        <w:t xml:space="preserve">PR : Période de référence</w:t>
+      </w:r>
+    </w:p>
+    <w:p>
+      <w:pPr>
+        <w:pStyle w:val="Corpsdetexte"/>
+      </w:pPr>
+      <w:r>
+        <w:t xml:space="preserve">RN : Route Nationale</w:t>
+      </w:r>
+    </w:p>
+    <w:p>
+      <w:pPr>
+        <w:pStyle w:val="Corpsdetexte"/>
+      </w:pPr>
+      <w:r>
+        <w:t xml:space="preserve">SRA : Système de Riziculture Améliorée</w:t>
+      </w:r>
+    </w:p>
+    <w:p>
+      <w:pPr>
+        <w:pStyle w:val="Corpsdetexte"/>
+      </w:pPr>
+      <w:r>
+        <w:t xml:space="preserve">SRI : Système de Riziculture Intensive</w:t>
+      </w:r>
+    </w:p>
+    <w:p>
+      <w:pPr>
+        <w:pStyle w:val="Corpsdetexte"/>
+      </w:pPr>
+      <w:r>
+        <w:t xml:space="preserve">UC : Unité de Consommation</w:t>
       </w:r>
     </w:p>
     <w:bookmarkEnd w:id="1014"/>
-    <w:bookmarkStart w:id="1015" w:name="liste-des-tableaux"/>
-    <w:p>
-      <w:pPr>
-        <w:pStyle w:val="Titre2"/>
-      </w:pPr>
-      <w:r>
-        <w:t xml:space="preserve">Liste des tableaux</w:t>
-      </w:r>
-    </w:p>
     <w:bookmarkEnd w:id="1015"/>
-    <w:bookmarkStart w:id="1016" w:name="liste-des-acronymes"/>
-    <w:p>
-      <w:pPr>
-        <w:pStyle w:val="Titre2"/>
-      </w:pPr>
-      <w:r>
-        <w:t xml:space="preserve">Liste des acronymes</w:t>
-      </w:r>
-    </w:p>
-    <w:p>
-      <w:pPr>
-        <w:pStyle w:val="FirstParagraph"/>
-      </w:pPr>
-      <w:r>
-        <w:t xml:space="preserve">AP : Aire Protégée</w:t>
-      </w:r>
-    </w:p>
-    <w:p>
-      <w:pPr>
-        <w:pStyle w:val="Corpsdetexte"/>
-      </w:pPr>
-      <w:r>
-        <w:t xml:space="preserve">BETSAKA : Biodiversity-Economic Tradeoff and Synergy Assessments for Conservation Areas</w:t>
-      </w:r>
-    </w:p>
-    <w:p>
-      <w:pPr>
-        <w:pStyle w:val="Corpsdetexte"/>
-      </w:pPr>
-      <w:r>
-        <w:t xml:space="preserve">BTP : Bâtiment et Travaux Publics</w:t>
-      </w:r>
-    </w:p>
-    <w:p>
-      <w:pPr>
-        <w:pStyle w:val="Corpsdetexte"/>
-      </w:pPr>
-      <w:r>
-        <w:t xml:space="preserve">CE : Cours Élémentaire</w:t>
-      </w:r>
-    </w:p>
-    <w:p>
-      <w:pPr>
-        <w:pStyle w:val="Corpsdetexte"/>
-      </w:pPr>
-      <w:r>
-        <w:t xml:space="preserve">CERED : Centre d’Études et de Recherches Économiques pour le Développement</w:t>
-      </w:r>
-    </w:p>
-    <w:p>
-      <w:pPr>
-        <w:pStyle w:val="Corpsdetexte"/>
-      </w:pPr>
-      <w:r>
-        <w:t xml:space="preserve">CITI rév.4 : Classification internationale type, par industrie, de toutes les branches d’activité économique, révision 4</w:t>
-      </w:r>
-    </w:p>
-    <w:p>
-      <w:pPr>
-        <w:pStyle w:val="Corpsdetexte"/>
-      </w:pPr>
-      <w:r>
-        <w:t xml:space="preserve">CM : Chef de ménage</w:t>
-      </w:r>
-    </w:p>
-    <w:p>
-      <w:pPr>
-        <w:pStyle w:val="Corpsdetexte"/>
-      </w:pPr>
-      <w:r>
-        <w:t xml:space="preserve">CM1 : Cours Moyen 1ère année</w:t>
-      </w:r>
-    </w:p>
-    <w:p>
-      <w:pPr>
-        <w:pStyle w:val="Corpsdetexte"/>
-      </w:pPr>
-      <w:r>
-        <w:t xml:space="preserve">CM2 : Cours Moyen 2ème année</w:t>
-      </w:r>
-    </w:p>
-    <w:p>
-      <w:pPr>
-        <w:pStyle w:val="Corpsdetexte"/>
-      </w:pPr>
-      <w:r>
-        <w:t xml:space="preserve">CP1 : Cours Préparatoire 1ère année</w:t>
-      </w:r>
-    </w:p>
-    <w:p>
-      <w:pPr>
-        <w:pStyle w:val="Corpsdetexte"/>
-      </w:pPr>
-      <w:r>
-        <w:t xml:space="preserve">CP2 : Cours Préparatoire 2ème année</w:t>
-      </w:r>
-    </w:p>
-    <w:p>
-      <w:pPr>
-        <w:pStyle w:val="Corpsdetexte"/>
-      </w:pPr>
-      <w:r>
-        <w:t xml:space="preserve">DGM : Direction Générale de la Météorologie</w:t>
-      </w:r>
-    </w:p>
-    <w:p>
-      <w:pPr>
-        <w:pStyle w:val="Corpsdetexte"/>
-      </w:pPr>
-      <w:r>
-        <w:t xml:space="preserve">GPS : Global Positioning System</w:t>
-      </w:r>
-    </w:p>
-    <w:p>
-      <w:pPr>
-        <w:pStyle w:val="Corpsdetexte"/>
-      </w:pPr>
-      <w:r>
-        <w:t xml:space="preserve">HIMO : Haute Intensité de Main-d’Œuvre</w:t>
-      </w:r>
-    </w:p>
-    <w:p>
-      <w:pPr>
-        <w:pStyle w:val="Corpsdetexte"/>
-      </w:pPr>
-      <w:r>
-        <w:t xml:space="preserve">INSTAT : Institut National de la Statistique</w:t>
-      </w:r>
-    </w:p>
-    <w:p>
-      <w:pPr>
-        <w:pStyle w:val="Corpsdetexte"/>
-      </w:pPr>
-      <w:r>
-        <w:t xml:space="preserve">IPC : Indice des Prix à la Consommation</w:t>
-      </w:r>
-    </w:p>
-    <w:p>
-      <w:pPr>
-        <w:pStyle w:val="Corpsdetexte"/>
-      </w:pPr>
-      <w:r>
-        <w:t xml:space="preserve">IRD : Institut de Recherche pour le Développement</w:t>
-      </w:r>
-    </w:p>
-    <w:p>
-      <w:pPr>
-        <w:pStyle w:val="Corpsdetexte"/>
-      </w:pPr>
-      <w:r>
-        <w:t xml:space="preserve">Nb : Nombre</w:t>
-      </w:r>
-    </w:p>
-    <w:p>
-      <w:pPr>
-        <w:pStyle w:val="Corpsdetexte"/>
-      </w:pPr>
-      <w:r>
-        <w:t xml:space="preserve">OCDE : Organisation de Coopération et de Développement Économiques</w:t>
-      </w:r>
-    </w:p>
-    <w:p>
-      <w:pPr>
-        <w:pStyle w:val="Corpsdetexte"/>
-      </w:pPr>
-      <w:r>
-        <w:t xml:space="preserve">OR : Observatoire rural</w:t>
-      </w:r>
-    </w:p>
-    <w:p>
-      <w:pPr>
-        <w:pStyle w:val="Corpsdetexte"/>
-      </w:pPr>
-      <w:r>
-        <w:t xml:space="preserve">PR : Période de référence</w:t>
-      </w:r>
-    </w:p>
-    <w:p>
-      <w:pPr>
-        <w:pStyle w:val="Corpsdetexte"/>
-      </w:pPr>
-      <w:r>
-        <w:t xml:space="preserve">RN : Route Nationale</w:t>
-      </w:r>
-    </w:p>
-    <w:p>
-      <w:pPr>
-        <w:pStyle w:val="Corpsdetexte"/>
-      </w:pPr>
-      <w:r>
-        <w:t xml:space="preserve">SRA : Système de Riziculture Améliorée</w:t>
-      </w:r>
-    </w:p>
-    <w:p>
-      <w:pPr>
-        <w:pStyle w:val="Corpsdetexte"/>
-      </w:pPr>
-      <w:r>
-        <w:t xml:space="preserve">SRI : Système de Riziculture Intensive</w:t>
-      </w:r>
-    </w:p>
-    <w:p>
-      <w:pPr>
-        <w:pStyle w:val="Corpsdetexte"/>
-      </w:pPr>
-      <w:r>
-        <w:t xml:space="preserve">UC : Unité de Consommation</w:t>
-      </w:r>
-    </w:p>
-    <w:bookmarkEnd w:id="1016"/>
-    <w:bookmarkEnd w:id="1017"/>
-    <w:bookmarkStart w:id="1036" w:name="annexe"/>
+    <w:bookmarkStart w:id="1034" w:name="annexe"/>
     <w:p>
       <w:pPr>
         <w:pStyle w:val="Titre1"/>
@@ -21674,7 +21654,7 @@
         <w:t xml:space="preserve">Annexe</w:t>
       </w:r>
     </w:p>
-    <w:bookmarkStart w:id="1021" w:name="annexe-a-approbation-éthique"/>
+    <w:bookmarkStart w:id="1019" w:name="annexe-a-approbation-éthique"/>
     <w:p>
       <w:pPr>
         <w:pStyle w:val="Titre2"/>
@@ -21692,18 +21672,18 @@
           <wp:inline>
             <wp:extent cx="4169152" cy="5927613"/>
             <wp:effectExtent b="0" l="0" r="0" t="0"/>
-            <wp:docPr descr="" title="" id="1019" name="Picture"/>
+            <wp:docPr descr="" title="" id="1017" name="Picture"/>
             <a:graphic>
               <a:graphicData uri="http://schemas.openxmlformats.org/drawingml/2006/picture">
                 <pic:pic>
                   <pic:nvPicPr>
-                    <pic:cNvPr descr="images/Image_ethique.png" id="1020" name="Picture"/>
+                    <pic:cNvPr descr="images/Image_ethique.png" id="1018" name="Picture"/>
                     <pic:cNvPicPr>
                       <a:picLocks noChangeArrowheads="1" noChangeAspect="1"/>
                     </pic:cNvPicPr>
                   </pic:nvPicPr>
                   <pic:blipFill>
-                    <a:blip r:embed="rId1018"/>
+                    <a:blip r:embed="rId1016"/>
                     <a:stretch>
                       <a:fillRect/>
                     </a:stretch>
@@ -21730,8 +21710,8 @@
         </w:drawing>
       </w:r>
     </w:p>
-    <w:bookmarkEnd w:id="1021"/>
-    <w:bookmarkStart w:id="1025" w:name="Xc4c562dbc05b004e3e3775f8bf742dcfe8e2e8f"/>
+    <w:bookmarkEnd w:id="1019"/>
+    <w:bookmarkStart w:id="1023" w:name="Xc4c562dbc05b004e3e3775f8bf742dcfe8e2e8f"/>
     <w:p>
       <w:pPr>
         <w:pStyle w:val="Titre2"/>
@@ -21749,18 +21729,18 @@
           <wp:inline>
             <wp:extent cx="5969000" cy="4331815"/>
             <wp:effectExtent b="0" l="0" r="0" t="0"/>
-            <wp:docPr descr="" title="" id="1023" name="Picture"/>
+            <wp:docPr descr="" title="" id="1021" name="Picture"/>
             <a:graphic>
               <a:graphicData uri="http://schemas.openxmlformats.org/drawingml/2006/picture">
                 <pic:pic>
                   <pic:nvPicPr>
-                    <pic:cNvPr descr="images/calendrier_agri_nord_ouest.png" id="1024" name="Picture"/>
+                    <pic:cNvPr descr="images/calendrier_agri_nord_ouest.png" id="1022" name="Picture"/>
                     <pic:cNvPicPr>
                       <a:picLocks noChangeArrowheads="1" noChangeAspect="1"/>
                     </pic:cNvPicPr>
                   </pic:nvPicPr>
                   <pic:blipFill>
-                    <a:blip r:embed="rId1022"/>
+                    <a:blip r:embed="rId1020"/>
                     <a:stretch>
                       <a:fillRect/>
                     </a:stretch>
@@ -21803,8 +21783,8 @@
         <w:t xml:space="preserve">Calendrier agricole, Mars 2001/Direction de l’Agriculture</w:t>
       </w:r>
     </w:p>
-    <w:bookmarkEnd w:id="1025"/>
-    <w:bookmarkStart w:id="1035" w:name="X9d4b724373d5a24512a2daa4c21711385ac2c45"/>
+    <w:bookmarkEnd w:id="1023"/>
+    <w:bookmarkStart w:id="1033" w:name="X9d4b724373d5a24512a2daa4c21711385ac2c45"/>
     <w:p>
       <w:pPr>
         <w:pStyle w:val="Titre2"/>
@@ -21822,18 +21802,18 @@
           <wp:inline>
             <wp:extent cx="5969000" cy="3960595"/>
             <wp:effectExtent b="0" l="0" r="0" t="0"/>
-            <wp:docPr descr="" title="" id="1027" name="Picture"/>
+            <wp:docPr descr="" title="" id="1025" name="Picture"/>
             <a:graphic>
               <a:graphicData uri="http://schemas.openxmlformats.org/drawingml/2006/picture">
                 <pic:pic>
                   <pic:nvPicPr>
-                    <pic:cNvPr descr="images/calendrier_agri_moyen_est1.png" id="1028" name="Picture"/>
+                    <pic:cNvPr descr="images/calendrier_agri_moyen_est1.png" id="1026" name="Picture"/>
                     <pic:cNvPicPr>
                       <a:picLocks noChangeArrowheads="1" noChangeAspect="1"/>
                     </pic:cNvPicPr>
                   </pic:nvPicPr>
                   <pic:blipFill>
-                    <a:blip r:embed="rId1026"/>
+                    <a:blip r:embed="rId1024"/>
                     <a:stretch>
                       <a:fillRect/>
                     </a:stretch>
@@ -21867,18 +21847,18 @@
           <wp:inline>
             <wp:extent cx="5969000" cy="3607308"/>
             <wp:effectExtent b="0" l="0" r="0" t="0"/>
-            <wp:docPr descr="" title="" id="1030" name="Picture"/>
+            <wp:docPr descr="" title="" id="1028" name="Picture"/>
             <a:graphic>
               <a:graphicData uri="http://schemas.openxmlformats.org/drawingml/2006/picture">
                 <pic:pic>
                   <pic:nvPicPr>
-                    <pic:cNvPr descr="images/calendrier_agri_moyen_est2.png" id="1031" name="Picture"/>
+                    <pic:cNvPr descr="images/calendrier_agri_moyen_est2.png" id="1029" name="Picture"/>
                     <pic:cNvPicPr>
                       <a:picLocks noChangeArrowheads="1" noChangeAspect="1"/>
                     </pic:cNvPicPr>
                   </pic:nvPicPr>
                   <pic:blipFill>
-                    <a:blip r:embed="rId1029"/>
+                    <a:blip r:embed="rId1027"/>
                     <a:stretch>
                       <a:fillRect/>
                     </a:stretch>
@@ -21912,18 +21892,18 @@
           <wp:inline>
             <wp:extent cx="5969000" cy="2638545"/>
             <wp:effectExtent b="0" l="0" r="0" t="0"/>
-            <wp:docPr descr="" title="" id="1033" name="Picture"/>
+            <wp:docPr descr="" title="" id="1031" name="Picture"/>
             <a:graphic>
               <a:graphicData uri="http://schemas.openxmlformats.org/drawingml/2006/picture">
                 <pic:pic>
                   <pic:nvPicPr>
-                    <pic:cNvPr descr="images/calendrier_agri_moyen_est3.png" id="1034" name="Picture"/>
+                    <pic:cNvPr descr="images/calendrier_agri_moyen_est3.png" id="1032" name="Picture"/>
                     <pic:cNvPicPr>
                       <a:picLocks noChangeArrowheads="1" noChangeAspect="1"/>
                     </pic:cNvPicPr>
                   </pic:nvPicPr>
                   <pic:blipFill>
-                    <a:blip r:embed="rId1032"/>
+                    <a:blip r:embed="rId1030"/>
                     <a:stretch>
                       <a:fillRect/>
                     </a:stretch>
@@ -21966,8 +21946,8 @@
         <w:t xml:space="preserve">Calendrier agricole, Mars 2001/Direction de l’Agriculture</w:t>
       </w:r>
     </w:p>
-    <w:bookmarkEnd w:id="1035"/>
-    <w:bookmarkEnd w:id="1036"/>
+    <w:bookmarkEnd w:id="1033"/>
+    <w:bookmarkEnd w:id="1034"/>
     <w:sectPr>
       <w:footnotePr>
         <w:numRestart w:val="eachSect"/>

</xml_diff>